<commit_message>
07.11: đề ngày 29/10/2026, ghi rõ số liệu tính đến 28/10/2026
- Ngày đơn 29/10/2026; các số ngày ghi mốc "đến ngày 28/10/2026" để khớp
  hai tài liệu kèm theo (07.9, 07.10) lập cùng ngày 28/10.
- Thêm một câu: cùng ngày gửi tâm thư đến Chủ tịch nước và đơn kiến nghị
  đến Ủy ban Thường vụ Quốc hội. Bản công khai không ghi đường dẫn thư mục
  hồ sơ số hoá.
- Khối ký tên đi cùng hai đoạn kết, không đứng riêng một trang.

Co-Authored-By: Claude Opus 5.5 <noreply@anthropic.com>
Claude-Session: https://claude.ai/code/session_015JTqgRgcwweC4y1McBEsCj
</commit_message>
<xml_diff>
--- a/07.11 - Don kien nghi Thanh tra Chinh phu.docx
+++ b/07.11 - Don kien nghi Thanh tra Chinh phu.docx
@@ -23,7 +23,7 @@
         <w:pStyle w:val="Ngaythang"/>
       </w:pPr>
       <w:r>
-        <w:t xml:space="preserve">Lâm Đồng, ngày 28 tháng 10 năm 2026</w:t>
+        <w:t xml:space="preserve">Lâm Đồng, ngày 29 tháng 10 năm 2026</w:t>
       </w:r>
     </w:p>
     <w:p>
@@ -352,7 +352,7 @@
         <w:spacing w:before="120"/>
       </w:pPr>
       <w:r>
-        <w:t xml:space="preserve">Tôi kiến nghị với tư cách công dân và phụ huynh học sinh, về một vụ việc tôi đã theo đuổi bằng đơn thư liên tục từ ngày 30/10/2025 đến nay —</w:t>
+        <w:t xml:space="preserve">Tôi kiến nghị với tư cách công dân và phụ huynh học sinh, về một vụ việc tôi đã theo đuổi bằng đơn thư liên tục từ ngày 30/10/2025 đến ngày 28/10/2026 là</w:t>
       </w:r>
       <w:r>
         <w:t xml:space="preserve"> </w:t>
@@ -1960,7 +1960,7 @@
         <w:t xml:space="preserve"> </w:t>
       </w:r>
       <w:r>
-        <w:t xml:space="preserve">Ngày 16/5/2026 lúc 11 giờ 40, Sở nhận hai đơn của tôi, hai bưu gửi riêng, đều có báo phát: đơn tố cáo gửi Chánh Thanh tra Sở (ES805564955VN) — mốc xử lý ban đầu chậm nhất 29/5/2026, đến nay quá</w:t>
+        <w:t xml:space="preserve">Ngày 16/5/2026 lúc 11 giờ 40, Sở nhận hai đơn của tôi, hai bưu gửi riêng, đều có báo phát: đơn tố cáo gửi Chánh Thanh tra Sở (ES805564955VN) — mốc xử lý ban đầu chậm nhất 29/5/2026, đến ngày 28/10/2026 quá</w:t>
       </w:r>
       <w:r>
         <w:t xml:space="preserve"> </w:t>
@@ -3217,6 +3217,14 @@
         <w:t xml:space="preserve">Toàn bộ chứng từ bưu chính kiểm chứng được độc lập với lời trình bày của tôi và của mọi cơ quan: mỗi mã tra được trên hệ thống của doanh nghiệp bưu chính, có ngày giờ giao và tên người nhận.</w:t>
       </w:r>
     </w:p>
+    <w:p>
+      <w:pPr>
+        <w:pStyle w:val="BodyText"/>
+      </w:pPr>
+      <w:r>
+        <w:t xml:space="preserve">Cùng ngày với đơn này, tôi gửi tâm thư đến Chủ tịch nước và đơn kiến nghị đến Ủy ban Thường vụ Quốc hội về cùng vụ việc; bản gửi ghi đường dẫn thư mục hồ sơ số hoá dùng chung cho ba văn bản.</w:t>
+      </w:r>
+    </w:p>
     <w:bookmarkEnd w:id="28"/>
     <w:bookmarkStart w:id="29" w:name="vi.-cam-đoan"/>
     <w:p>
@@ -3238,6 +3246,7 @@
     <w:p>
       <w:pPr>
         <w:pStyle w:val="BodyText"/>
+        <w:keepNext/>
       </w:pPr>
       <w:r>
         <w:t xml:space="preserve">Kính đề nghị Thanh tra Chính phủ trả lời bằng văn bản về địa chỉ đã ghi tại mục I.</w:t>
@@ -3246,6 +3255,7 @@
     <w:p>
       <w:pPr>
         <w:pStyle w:val="BodyText"/>
+        <w:keepNext/>
       </w:pPr>
       <w:r>
         <w:t xml:space="preserve">Trân trọng cảm ơn.</w:t>
@@ -3341,7 +3351,7 @@
         <w:i/>
         <w:sz w:val="20"/>
       </w:rPr>
-      <w:t xml:space="preserve">Đơn kiến nghị gửi Tổng Thanh tra Chính phủ · Ngày 28/10/2026 · Trang </w:t>
+      <w:t xml:space="preserve">Đơn kiến nghị gửi Tổng Thanh tra Chính phủ · Ngày 29/10/2026 · Trang </w:t>
     </w:r>
     <w:r>
       <w:rPr>

</xml_diff>

<commit_message>
07.11: Thanh tra Chính phủ theo dõi hết các nơi chưa trả lời
- III.2 có bảy việc: thêm Đơn bổ sung tài liệu, chứng cứ nộp phường
  ngày 23/9/2026 (theo lời mời tại Công văn 6689) và đơn kiến nghị gửi
  Bộ GD&ĐT ngày 21/8/2026; đánh lại số theo cơ quan.
- Đề nghị 3 liệt kê đủ phường (09/7, 23/9, 06/10), Sở (16/5, 05/10) và
  Bộ; ghi rõ đơn gửi Đoàn ĐBQH tỉnh và kiến nghị gửi UBKT Tỉnh ủy thuộc
  kênh giám sát khác.
- Phiếu chuyển 2707 gửi phường, không gửi người kiến nghị; người kiến
  nghị chỉ biết qua Công văn 6689.
- Số ngày giữ mốc 28/10/2026; ghi thêm tình trạng không đổi đến ngày
  ký đơn 29/10/2026.
- Gọn các chỗ lặp để đơn vẫn 10 trang, ký và nơi nhận ở trang 10.
- 07.10: ghi chú Phiếu 2707 nói rõ phiếu gửi phường.

Co-Authored-By: Claude Opus 5.5 <noreply@anthropic.com>
Claude-Session: https://claude.ai/code/session_015JTqgRgcwweC4y1McBEsCj
</commit_message>
<xml_diff>
--- a/07.11 - Don kien nghi Thanh tra Chinh phu.docx
+++ b/07.11 - Don kien nghi Thanh tra Chinh phu.docx
@@ -39,7 +39,7 @@
         <w:pStyle w:val="Trichyeu"/>
       </w:pPr>
       <w:r>
-        <w:t xml:space="preserve">(V/v: kiến nghị kiểm tra việc xử lý đơn tại Thanh tra tỉnh Lâm Đồng qua Phiếu hướng dẫn số 2960/HD-TTr ngày 28/9/2026 và Công văn số 3292/TTr-PKNTC.1 ngày 19/10/2026; kiểm tra việc xử lý Đơn tố cáo ngày 14/9/2026 gửi Chủ tịch Ủy ban nhân dân tỉnh Lâm Đồng; theo dõi các hồ sơ quá hạn tại tỉnh Lâm Đồng; hướng dẫn áp dụng Thông tư số 05/2021/TT-TTCP)</w:t>
+        <w:t xml:space="preserve">(V/v: kiến nghị kiểm tra việc xử lý đơn tại Thanh tra tỉnh Lâm Đồng qua Phiếu hướng dẫn số 2960/HD-TTr ngày 28/9/2026 và Công văn số 3292/TTr-PKNTC.1 ngày 19/10/2026; kiểm tra việc xử lý Đơn tố cáo ngày 14/9/2026 gửi Chủ tịch Ủy ban nhân dân tỉnh Lâm Đồng; theo dõi việc giải quyết các đơn chưa được trả lời tại tỉnh Lâm Đồng và tại Bộ Giáo dục và Đào tạo; hướng dẫn áp dụng Thông tư số 05/2021/TT-TTCP)</w:t>
       </w:r>
     </w:p>
     <w:p>
@@ -792,6 +792,14 @@
         <w:spacing w:before="120"/>
       </w:pPr>
       <w:r>
+        <w:t xml:space="preserve">Số ngày trong đơn tính đến ngày 28/10/2026, như ở Tài liệu số 1 và số 2; đến ngày ký đơn này (29/10/2026), tôi vẫn chưa nhận được thêm văn bản nào.</w:t>
+      </w:r>
+    </w:p>
+    <w:p>
+      <w:pPr>
+        <w:pStyle w:val="BodyText"/>
+      </w:pPr>
+      <w:r>
         <w:rPr>
           <w:bCs/>
           <w:b/>
@@ -1694,13 +1702,13 @@
       </w:r>
     </w:p>
     <w:bookmarkEnd w:id="22"/>
-    <w:bookmarkStart w:id="23" w:name="Xc2c58d6fc95bbfdc2343a3e5b47db03ee906d7d"/>
+    <w:bookmarkStart w:id="23" w:name="X267d2f5d78d0d33c234c4cd0e966210680b6b9d"/>
     <w:p>
       <w:pPr>
         <w:pStyle w:val="Heading3"/>
       </w:pPr>
       <w:r>
-        <w:t xml:space="preserve">III.2. Kiến nghị kiểm tra việc thực hiện pháp luật về xử lý đơn, giải quyết khiếu nại, tố cáo tại tỉnh Lâm Đồng đối với hồ sơ này</w:t>
+        <w:t xml:space="preserve">III.2. Kiến nghị kiểm tra việc thực hiện pháp luật về xử lý đơn, giải quyết khiếu nại, tố cáo đối với hồ sơ này tại tỉnh Lâm Đồng và tại Bộ Giáo dục và Đào tạo</w:t>
       </w:r>
     </w:p>
     <w:p>
@@ -1708,7 +1716,7 @@
         <w:pStyle w:val="FirstParagraph"/>
       </w:pPr>
       <w:r>
-        <w:t xml:space="preserve">Tôi đề nghị kiểm tra năm việc có mốc ngày tháng rõ ràng, mỗi việc đều có chứng từ:</w:t>
+        <w:t xml:space="preserve">Tôi đề nghị kiểm tra bảy việc có mốc ngày tháng rõ ràng, mỗi việc đều có chứng từ:</w:t>
       </w:r>
     </w:p>
     <w:p>
@@ -1819,13 +1827,40 @@
           <w:bCs/>
           <w:b/>
         </w:rPr>
-        <w:t xml:space="preserve">Việc 2 — Một đơn khiếu nại đã qua mốc 07 ngày làm việc, tôi chưa nhận được cả văn bản không thụ lý.</w:t>
-      </w:r>
-      <w:r>
-        <w:t xml:space="preserve"> </w:t>
-      </w:r>
-      <w:r>
-        <w:t xml:space="preserve">Ngày 06/10/2026 lúc 17 giờ, Ủy ban nhân dân phường nhận Đơn khiếu nại lần đầu của tôi đối với các kết luận tại Mục 1, 2, 3 của Thông báo 5553, có giấy tiếp nhận. Theo Điều 27 Luật Khiếu nại (sửa đổi bởi Luật số 136/2025/QH15, hiệu lực từ 01/7/2026), khiếu nại thuộc thẩm quyền và đủ điều kiện thì phải được thụ lý và thông báo trong 07 ngày làm việc — mốc 15/10/2026; trường hợp không thụ lý thì phải nêu rõ lý do. Đến ngày 28/10/2026, sau mốc ấy</w:t>
+        <w:t xml:space="preserve">Việc 2 — Đơn bổ sung tài liệu, chứng cứ nộp theo lời mời của chính Ủy ban nhân dân phường, tôi chưa nhận được văn bản nào.</w:t>
+      </w:r>
+      <w:r>
+        <w:t xml:space="preserve"> </w:t>
+      </w:r>
+      <w:r>
+        <w:t xml:space="preserve">Công văn 6689 ngày 21/9/2026 mời tôi bổ sung tài liệu, chứng cứ và hẹn</w:t>
+      </w:r>
+      <w:r>
+        <w:t xml:space="preserve"> </w:t>
+      </w:r>
+      <w:r>
+        <w:rPr>
+          <w:iCs/>
+          <w:i/>
+        </w:rPr>
+        <w:t xml:space="preserve">“</w:t>
+      </w:r>
+      <w:r>
+        <w:rPr>
+          <w:iCs/>
+          <w:i/>
+        </w:rPr>
+        <w:t xml:space="preserve">tiếp nhận, xem xét, xử lý theo quy định</w:t>
+      </w:r>
+      <w:r>
+        <w:rPr>
+          <w:iCs/>
+          <w:i/>
+        </w:rPr>
+        <w:t xml:space="preserve">”</w:t>
+      </w:r>
+      <w:r>
+        <w:t xml:space="preserve">. Ngày 23/9/2026 lúc 17 giờ, tôi nộp Đơn bổ sung tài liệu, chứng cứ tại Văn phòng HĐND và UBND phường, có giấy tiếp nhận. Đến ngày 28/10/2026 —</w:t>
       </w:r>
       <w:r>
         <w:t xml:space="preserve"> </w:t>
@@ -1835,10 +1870,13 @@
           <w:bCs/>
           <w:b/>
         </w:rPr>
-        <w:t xml:space="preserve">09 ngày làm việc</w:t>
-      </w:r>
-      <w:r>
-        <w:t xml:space="preserve">, tôi chưa nhận được văn bản nào, kể cả văn bản cho biết đơn không thuộc thẩm quyền hay không đủ điều kiện thụ lý. Kính đề nghị kiểm tra cả việc phân loại lá đơn ấy và lý do chưa thông báo. Thanh tra tỉnh nhận đơn đề nghị theo dõi, đôn đốc việc thụ lý này ngày 12/10/2026; Công văn 3292 ký ngày 19/10/2026 không có dòng nào về việc này.</w:t>
+        <w:t xml:space="preserve">35 ngày</w:t>
+      </w:r>
+      <w:r>
+        <w:t xml:space="preserve"> </w:t>
+      </w:r>
+      <w:r>
+        <w:t xml:space="preserve">sau — tôi chưa nhận được văn bản nào.</w:t>
       </w:r>
     </w:p>
     <w:p>
@@ -1850,13 +1888,13 @@
           <w:bCs/>
           <w:b/>
         </w:rPr>
-        <w:t xml:space="preserve">Việc 3 — Đơn tố cáo gửi Chủ tịch Ủy ban nhân dân tỉnh Lâm Đồng, đã qua mốc xử lý ban đầu, tôi chưa nhận được văn bản nào.</w:t>
-      </w:r>
-      <w:r>
-        <w:t xml:space="preserve"> </w:t>
-      </w:r>
-      <w:r>
-        <w:t xml:space="preserve">Báo phát lúc 10 giờ 09 ngày 17/9/2026 (bưu gửi TOM152242469648); mốc cuối 01/10/2026; đến ngày 28/10/2026 —</w:t>
+        <w:t xml:space="preserve">Việc 3 — Một đơn khiếu nại đã qua mốc 07 ngày làm việc, tôi chưa nhận được cả văn bản không thụ lý.</w:t>
+      </w:r>
+      <w:r>
+        <w:t xml:space="preserve"> </w:t>
+      </w:r>
+      <w:r>
+        <w:t xml:space="preserve">Ngày 06/10/2026 lúc 17 giờ, Ủy ban nhân dân phường nhận Đơn khiếu nại lần đầu của tôi đối với các kết luận tại Mục 1, 2, 3 của Thông báo 5553, có giấy tiếp nhận. Theo Điều 27 Luật Khiếu nại (sửa đổi bởi Luật số 136/2025/QH15, hiệu lực từ 01/7/2026), khiếu nại thuộc thẩm quyền và đủ điều kiện thì phải được thụ lý và thông báo trong 07 ngày làm việc — mốc 15/10/2026; trường hợp không thụ lý thì phải nêu rõ lý do. Đến ngày 28/10/2026, sau mốc ấy</w:t>
       </w:r>
       <w:r>
         <w:t xml:space="preserve"> </w:t>
@@ -1866,47 +1904,41 @@
           <w:bCs/>
           <w:b/>
         </w:rPr>
-        <w:t xml:space="preserve">41 ngày</w:t>
-      </w:r>
-      <w:r>
-        <w:t xml:space="preserve"> </w:t>
-      </w:r>
-      <w:r>
-        <w:t xml:space="preserve">sau khi nhận, sau mốc cuối</w:t>
-      </w:r>
-      <w:r>
-        <w:t xml:space="preserve"> </w:t>
-      </w:r>
+        <w:t xml:space="preserve">09 ngày làm việc</w:t>
+      </w:r>
+      <w:r>
+        <w:t xml:space="preserve">, tôi chưa nhận được văn bản nào, kể cả văn bản cho biết đơn không thuộc thẩm quyền hay không đủ điều kiện thụ lý. Kính đề nghị kiểm tra cả việc phân loại lá đơn ấy và lý do chưa thông báo. Thanh tra tỉnh nhận đơn đề nghị theo dõi, đôn đốc việc thụ lý này ngày 12/10/2026; Công văn 3292 ký ngày 19/10/2026 không có dòng nào về việc này.</w:t>
+      </w:r>
+    </w:p>
+    <w:p>
+      <w:pPr>
+        <w:pStyle w:val="BodyText"/>
+      </w:pPr>
       <w:r>
         <w:rPr>
           <w:bCs/>
           <w:b/>
         </w:rPr>
-        <w:t xml:space="preserve">27 ngày</w:t>
-      </w:r>
-      <w:r>
-        <w:t xml:space="preserve"> </w:t>
-      </w:r>
-      <w:r>
-        <w:t xml:space="preserve">(chi tiết tại mục II). Trước đó, ngày 14/7/2026, tôi gửi Chủ tịch Ủy ban nhân dân tỉnh một báo cáo công dân để nắm toàn bộ vụ việc (bưu gửi ES807558135VN); báo cáo ấy không đề nghị trả lời, tôi nêu để Quý cơ quan biết vụ việc đã được báo cáo lên tỉnh từ tháng 7/2026.</w:t>
-      </w:r>
-    </w:p>
-    <w:p>
-      <w:pPr>
-        <w:pStyle w:val="BodyText"/>
-      </w:pPr>
+        <w:t xml:space="preserve">Việc 4 — Đơn tố cáo gửi Chủ tịch Ủy ban nhân dân tỉnh Lâm Đồng, đã qua mốc xử lý ban đầu, tôi chưa nhận được văn bản nào.</w:t>
+      </w:r>
+      <w:r>
+        <w:t xml:space="preserve"> </w:t>
+      </w:r>
+      <w:r>
+        <w:t xml:space="preserve">Báo phát ngày 17/9/2026; đến ngày 28/10/2026 —</w:t>
+      </w:r>
+      <w:r>
+        <w:t xml:space="preserve"> </w:t>
+      </w:r>
       <w:r>
         <w:rPr>
           <w:bCs/>
           <w:b/>
         </w:rPr>
-        <w:t xml:space="preserve">Việc 4 — Hai đơn Sở Giáo dục và Đào tạo nhận từ tháng 5/2026, tôi chưa nhận được thông báo xử lý đối với từng đơn.</w:t>
-      </w:r>
-      <w:r>
-        <w:t xml:space="preserve"> </w:t>
-      </w:r>
-      <w:r>
-        <w:t xml:space="preserve">Ngày 16/5/2026 lúc 11 giờ 40, Sở nhận hai đơn của tôi, hai bưu gửi riêng, đều có báo phát, không bưu gửi nào bị trả lại: đơn tố cáo, ghi gửi Chánh Thanh tra Sở (ES805564955VN); và đơn đề nghị thẩm định chuyên môn khẩn cấp, tổ chức tiết đính chính kiến thức, gửi Giám đốc Sở (ES805564941VN). Với đơn tố cáo, dù cơ quan nhận tự xử lý hay chuyển đơn, mốc chậm nhất theo Điều 24 Luật Tố cáo là 29/5/2026 — đến ngày 28/10/2026 đã qua</w:t>
+        <w:t xml:space="preserve">41 ngày</w:t>
+      </w:r>
+      <w:r>
+        <w:t xml:space="preserve">, sau mốc cuối</w:t>
       </w:r>
       <w:r>
         <w:t xml:space="preserve"> </w:t>
@@ -1916,62 +1948,130 @@
           <w:bCs/>
           <w:b/>
         </w:rPr>
-        <w:t xml:space="preserve">152 ngày</w:t>
-      </w:r>
-      <w:r>
-        <w:t xml:space="preserve">; tôi chưa nhận được thông báo thụ lý, không thụ lý hay chuyển đơn đối với đơn nào, cũng chưa có kết quả thẩm định. Công văn 6689 của Ủy ban nhân dân phường cho biết Sở đã chuyển về phường một đơn của tôi bằng Phiếu chuyển số 2707/SGDĐT-VP ngày 08/6/2026</w:t>
-      </w:r>
-      <w:r>
-        <w:t xml:space="preserve"> </w:t>
-      </w:r>
-      <w:r>
-        <w:rPr>
-          <w:iCs/>
-          <w:i/>
-        </w:rPr>
-        <w:t xml:space="preserve">“</w:t>
-      </w:r>
-      <w:r>
-        <w:rPr>
-          <w:iCs/>
-          <w:i/>
-        </w:rPr>
-        <w:t xml:space="preserve">để xem xét, xử lý theo thẩm quyền đối với các nội dung phản ánh, kiến nghị</w:t>
-      </w:r>
-      <w:r>
-        <w:rPr>
-          <w:iCs/>
-          <w:i/>
-        </w:rPr>
-        <w:t xml:space="preserve">”</w:t>
-      </w:r>
-      <w:r>
-        <w:t xml:space="preserve">; tôi chưa nhận được phiếu ấy và chưa được biết phiếu chuyển đơn nào, kèm tài liệu gì. Ngày 05/10/2026, Sở nhận thêm một đơn đề nghị của tôi gửi Giám đốc Sở (TOM153621923737), hỏi đúng điều này —</w:t>
-      </w:r>
-      <w:r>
-        <w:t xml:space="preserve"> </w:t>
-      </w:r>
+        <w:t xml:space="preserve">27 ngày</w:t>
+      </w:r>
+      <w:r>
+        <w:t xml:space="preserve"> </w:t>
+      </w:r>
+      <w:r>
+        <w:t xml:space="preserve">(chi tiết tại mục II). Vụ việc cũng đã được báo cáo lên Chủ tịch Ủy ban nhân dân tỉnh từ ngày 14/7/2026 (báo cáo công dân, bưu gửi ES807558135VN, không đề nghị trả lời).</w:t>
+      </w:r>
+    </w:p>
+    <w:p>
+      <w:pPr>
+        <w:pStyle w:val="BodyText"/>
+      </w:pPr>
       <w:r>
         <w:rPr>
           <w:bCs/>
           <w:b/>
         </w:rPr>
-        <w:t xml:space="preserve">23 ngày</w:t>
-      </w:r>
-      <w:r>
-        <w:t xml:space="preserve">, tôi chưa nhận được văn bản.</w:t>
-      </w:r>
-    </w:p>
-    <w:p>
-      <w:pPr>
-        <w:pStyle w:val="BodyText"/>
-      </w:pPr>
+        <w:t xml:space="preserve">Việc 5 — Hai đơn Sở Giáo dục và Đào tạo nhận từ tháng 5/2026, tôi chưa nhận được thông báo xử lý đối với từng đơn.</w:t>
+      </w:r>
+      <w:r>
+        <w:t xml:space="preserve"> </w:t>
+      </w:r>
+      <w:r>
+        <w:t xml:space="preserve">Ngày 16/5/2026 lúc 11 giờ 40, Sở nhận hai đơn của tôi, hai bưu gửi riêng, đều có báo phát, không bưu gửi nào bị trả lại: đơn tố cáo, ghi gửi Chánh Thanh tra Sở (ES805564955VN); và đơn đề nghị thẩm định chuyên môn khẩn cấp, tổ chức tiết đính chính kiến thức, gửi Giám đốc Sở (ES805564941VN). Với đơn tố cáo, dù cơ quan nhận tự xử lý hay chuyển đơn, mốc chậm nhất theo Điều 24 Luật Tố cáo là 29/5/2026 — đến ngày 28/10/2026 đã qua</w:t>
+      </w:r>
+      <w:r>
+        <w:t xml:space="preserve"> </w:t>
+      </w:r>
       <w:r>
         <w:rPr>
           <w:bCs/>
           <w:b/>
         </w:rPr>
-        <w:t xml:space="preserve">Việc 5 — Các câu hỏi chỉ Thanh tra tỉnh trả lời được đã đi qua hai lá đơn và hai văn bản mà chưa được trả lời.</w:t>
+        <w:t xml:space="preserve">152 ngày</w:t>
+      </w:r>
+      <w:r>
+        <w:t xml:space="preserve">; tôi chưa nhận được thông báo thụ lý, không thụ lý hay chuyển đơn đối với đơn nào, cũng chưa có kết quả thẩm định. Theo Công văn 6689 của Ủy ban nhân dân phường, Sở đã chuyển một đơn của tôi về phường bằng Phiếu chuyển số 2707/SGDĐT-VP ngày 08/6/2026,</w:t>
+      </w:r>
+      <w:r>
+        <w:t xml:space="preserve"> </w:t>
+      </w:r>
+      <w:r>
+        <w:rPr>
+          <w:iCs/>
+          <w:i/>
+        </w:rPr>
+        <w:t xml:space="preserve">“</w:t>
+      </w:r>
+      <w:r>
+        <w:rPr>
+          <w:iCs/>
+          <w:i/>
+        </w:rPr>
+        <w:t xml:space="preserve">để xem xét, xử lý theo thẩm quyền đối với các nội dung phản ánh, kiến nghị</w:t>
+      </w:r>
+      <w:r>
+        <w:rPr>
+          <w:iCs/>
+          <w:i/>
+        </w:rPr>
+        <w:t xml:space="preserve">”</w:t>
+      </w:r>
+      <w:r>
+        <w:t xml:space="preserve">. Phiếu ấy gửi phường, không gửi tôi; tôi không nhận được thông báo nào của Sở về việc chuyển đơn, chỉ biết đến phiếu khi đọc Công văn 6689 ngày 21/9/2026, và đến nay chưa được biết phiếu chuyển đơn nào, kèm tài liệu gì. Ngày 05/10/2026, Sở nhận thêm một đơn đề nghị của tôi gửi Giám đốc Sở (TOM153621923737), hỏi đúng điều này —</w:t>
+      </w:r>
+      <w:r>
+        <w:t xml:space="preserve"> </w:t>
+      </w:r>
+      <w:r>
+        <w:rPr>
+          <w:bCs/>
+          <w:b/>
+        </w:rPr>
+        <w:t xml:space="preserve">23 ngày</w:t>
+      </w:r>
+      <w:r>
+        <w:t xml:space="preserve">, tôi chưa nhận được văn bản.</w:t>
+      </w:r>
+    </w:p>
+    <w:p>
+      <w:pPr>
+        <w:pStyle w:val="BodyText"/>
+      </w:pPr>
+      <w:r>
+        <w:rPr>
+          <w:bCs/>
+          <w:b/>
+        </w:rPr>
+        <w:t xml:space="preserve">Việc 6 — Đơn kiến nghị gửi Bộ Giáo dục và Đào tạo, tôi chưa nhận được văn bản nào.</w:t>
+      </w:r>
+      <w:r>
+        <w:t xml:space="preserve"> </w:t>
+      </w:r>
+      <w:r>
+        <w:t xml:space="preserve">Ngày 21/8/2026, tôi gửi Bộ Giáo dục và Đào tạo đơn kiến nghị về nội dung chuyên môn của tiết dạy (bưu gửi ES805344322VN, có phiếu báo phát EX139130389VN). Đến ngày 28/10/2026 —</w:t>
+      </w:r>
+      <w:r>
+        <w:t xml:space="preserve"> </w:t>
+      </w:r>
+      <w:r>
+        <w:rPr>
+          <w:bCs/>
+          <w:b/>
+        </w:rPr>
+        <w:t xml:space="preserve">68 ngày</w:t>
+      </w:r>
+      <w:r>
+        <w:t xml:space="preserve"> </w:t>
+      </w:r>
+      <w:r>
+        <w:t xml:space="preserve">sau ngày gửi — tôi chưa nhận được văn bản nào, kể cả văn bản chuyển đơn.</w:t>
+      </w:r>
+    </w:p>
+    <w:p>
+      <w:pPr>
+        <w:pStyle w:val="BodyText"/>
+      </w:pPr>
+      <w:r>
+        <w:rPr>
+          <w:bCs/>
+          <w:b/>
+        </w:rPr>
+        <w:t xml:space="preserve">Việc 7 — Các câu hỏi chỉ Thanh tra tỉnh trả lời được đã đi qua hai lá đơn và hai văn bản mà chưa được trả lời.</w:t>
       </w:r>
       <w:r>
         <w:t xml:space="preserve"> </w:t>
@@ -2083,7 +2183,7 @@
         </w:numPr>
       </w:pPr>
       <w:r>
-        <w:t xml:space="preserve">Theo dõi, đôn đốc việc giải quyết các hồ sơ nêu tại Việc 1, Việc 2 và Việc 4 thông qua Chủ tịch Ủy ban nhân dân tỉnh Lâm Đồng, và yêu cầu báo cáo kết quả; khi kiểm tra, thu thập hai văn bản tôi chưa được cấp: Công văn số 1436/TTr-TCDKNTC ngày 22/5/2026 và Phiếu chuyển số 2707/SGDĐT-VP ngày 08/6/2026, cùng tài liệu chuyển kèm.</w:t>
+        <w:t xml:space="preserve">Theo dõi, đôn đốc đến kết quả việc giải quyết các đơn, hồ sơ sau, mà tôi chưa nhận được văn bản trả lời: tại Ủy ban nhân dân phường Phan Thiết — Hồ sơ tố cáo nhận ngày 09/7/2026, Đơn bổ sung tài liệu, chứng cứ nhận ngày 23/9/2026 và Đơn khiếu nại nhận ngày 06/10/2026 (Việc 1, 2, 3); tại Sở Giáo dục và Đào tạo — hai đơn nhận ngày 16/5/2026 và đơn nhận ngày 05/10/2026 (Việc 5); hai nơi này thông qua Chủ tịch Ủy ban nhân dân tỉnh Lâm Đồng; tại Bộ Giáo dục và Đào tạo — Đơn kiến nghị gửi ngày 21/8/2026 (Việc 6). Yêu cầu các nơi ấy báo cáo kết quả. Khi kiểm tra, thu thập hai văn bản tôi chưa được cấp: Công văn số 1436/TTr-TCDKNTC ngày 22/5/2026 và Phiếu chuyển số 2707/SGDĐT-VP ngày 08/6/2026, cùng tài liệu chuyển kèm. Đơn gửi Đoàn đại biểu Quốc hội tỉnh và kiến nghị gửi Ủy ban Kiểm tra Tỉnh ủy thuộc kênh giám sát khác, nên tôi không đề nghị ở đây.</w:t>
       </w:r>
     </w:p>
     <w:p>
@@ -2107,7 +2207,7 @@
         </w:numPr>
       </w:pPr>
       <w:r>
-        <w:t xml:space="preserve">Trường hợp có nội dung không thuộc thẩm quyền của Thanh tra Chính phủ: chuyển đơn và thông báo cho tôi theo khoản 2 Điều 20 Thông tư 05, ghi rõ nơi nhận, số và ngày văn bản chuyển, kèm yêu cầu nơi nhận báo cáo kết quả. Kính đề nghị không chuyển đơn về chính các cơ quan mà đơn này kiến nghị kiểm tra mà không kèm yêu cầu báo cáo kết quả.</w:t>
+        <w:t xml:space="preserve">Trường hợp có nội dung không thuộc thẩm quyền của Thanh tra Chính phủ: chuyển đơn và thông báo cho tôi theo khoản 2 Điều 20 Thông tư 05, ghi rõ nơi nhận, số và ngày văn bản chuyển, kèm yêu cầu nơi nhận báo cáo kết quả; hoặc hướng dẫn tôi bằng phiếu ghi rõ từng nội dung và nơi gửi — tôi sẽ làm đúng, như đã làm với Phiếu hướng dẫn 2960: trong 08 ngày, tôi đã tách và nộp lại hai đơn riêng. Kính đề nghị không chuyển đơn về chính các cơ quan mà đơn này kiến nghị kiểm tra mà không kèm yêu cầu báo cáo kết quả.</w:t>
       </w:r>
     </w:p>
     <w:p>
@@ -2174,7 +2274,7 @@
         <w:t xml:space="preserve"> </w:t>
       </w:r>
       <w:r>
-        <w:t xml:space="preserve">Thanh tra Chính phủ là cơ quan thực hiện chức năng quản lý nhà nước về công tác tiếp công dân, giải quyết khiếu nại, tố cáo trong phạm vi cả nước (Nghị định số 109/2025/NĐ-CP). Chương IV Thông tư 05 quy định việc quản lý, theo dõi, kiểm tra, đôn đốc việc giải quyết đơn (Điều 29, Điều 30). Nội dung kiến nghị tại mục III.2 là việc thực hiện pháp luật ở các cơ quan cấp tỉnh và việc theo dõi đến kết quả — đúng phạm vi ấy.</w:t>
+        <w:t xml:space="preserve">Thanh tra Chính phủ là cơ quan thực hiện chức năng quản lý nhà nước về công tác tiếp công dân, giải quyết khiếu nại, tố cáo trong phạm vi cả nước (Nghị định số 109/2025/NĐ-CP). Chương IV Thông tư 05 quy định việc quản lý, theo dõi, kiểm tra, đôn đốc việc giải quyết đơn (Điều 29, Điều 30). Nội dung kiến nghị tại mục III.2 là việc thực hiện pháp luật ở các cơ quan cấp tỉnh và tại Bộ Giáo dục và Đào tạo, cùng việc theo dõi đến kết quả — đúng phạm vi ấy.</w:t>
       </w:r>
     </w:p>
     <w:p>
@@ -2210,25 +2310,7 @@
         <w:t xml:space="preserve"> </w:t>
       </w:r>
       <w:r>
-        <w:t xml:space="preserve">Phạm vi tôi đề nghị là phạm vi hẹp: không kết luận chuyên môn, không giải quyết lại khiếu nại hay tố cáo nào; chỉ hướng dẫn áp dụng quy phạm, kiểm tra việc thực hiện pháp luật trên một hồ sơ có đủ chứng từ ngày tháng, và theo dõi kết quả.</w:t>
-      </w:r>
-    </w:p>
-    <w:p>
-      <w:pPr>
-        <w:pStyle w:val="BodyText"/>
-      </w:pPr>
-      <w:r>
-        <w:rPr>
-          <w:bCs/>
-          <w:b/>
-        </w:rPr>
-        <w:t xml:space="preserve">Năm.</w:t>
-      </w:r>
-      <w:r>
-        <w:t xml:space="preserve"> </w:t>
-      </w:r>
-      <w:r>
-        <w:t xml:space="preserve">Nếu có nội dung nào không thuộc thẩm quyền của Thanh tra Chính phủ, kính đề nghị cho tôi biết cơ quan, người có thẩm quyền — bằng phiếu hướng dẫn ghi rõ từng nội dung và nơi gửi, hoặc bằng văn bản chuyển đơn kèm thông báo cho tôi. Tôi sẽ làm đúng hướng dẫn, như tôi đã làm với Phiếu hướng dẫn 2960: trong 08 ngày, tôi đã tách và nộp lại hai đơn riêng.</w:t>
+        <w:t xml:space="preserve">Phạm vi đề nghị là phạm vi hẹp: không kết luận chuyên môn, không giải quyết lại khiếu nại, tố cáo nào; chỉ hướng dẫn áp dụng quy phạm, kiểm tra việc thực hiện pháp luật trên hồ sơ có đủ chứng từ, và theo dõi kết quả.</w:t>
       </w:r>
     </w:p>
     <w:bookmarkEnd w:id="26"/>
@@ -2415,7 +2497,7 @@
               <w:rPr>
                 <w:sz w:val="22"/>
               </w:rPr>
-              <w:t xml:space="preserve">Nguyên văn hai văn bản; bảng tổng hợp 18 điểm sai phạm, mỗi điểm ghi quy định không được đáp ứng và mức độ (đọc được trên văn bản, hoặc cần cơ quan giải trình); bảng đối chiếu từng nội dung đơn với văn bản trả lời; đề nghị theo từng mục</w:t>
+              <w:t xml:space="preserve">Nguyên văn hai văn bản; bảng tổng hợp 18 điểm sai phạm, mỗi điểm ghi quy định không được đáp ứng và mức độ; bảng đối chiếu từng nội dung đơn với văn bản trả lời; đề nghị theo từng mục</w:t>
             </w:r>
           </w:p>
         </w:tc>
@@ -2748,7 +2830,7 @@
               <w:rPr>
                 <w:sz w:val="22"/>
               </w:rPr>
-              <w:t xml:space="preserve">Đơn lập theo hướng dẫn của Phiếu 2960</w:t>
+              <w:t xml:space="preserve">Lập theo Phiếu 2960</w:t>
             </w:r>
           </w:p>
         </w:tc>
@@ -2961,7 +3043,7 @@
               <w:rPr>
                 <w:sz w:val="22"/>
               </w:rPr>
-              <w:t xml:space="preserve">Hai văn bản của cùng một cơ quan, cách nhau 24 ngày</w:t>
+              <w:t xml:space="preserve">Cùng một cơ quan, cách nhau 24 ngày</w:t>
             </w:r>
           </w:p>
         </w:tc>
@@ -3006,7 +3088,7 @@
               <w:rPr>
                 <w:sz w:val="22"/>
               </w:rPr>
-              <w:t xml:space="preserve">Bản sao Đơn khiếu nại ngày 06/10/2026 và giấy tiếp nhận của Văn phòng HĐND và UBND phường Phan Thiết</w:t>
+              <w:t xml:space="preserve">Bản sao Đơn bổ sung tài liệu, chứng cứ ngày 23/9/2026, Đơn khiếu nại ngày 06/10/2026 và hai giấy tiếp nhận của phường</w:t>
             </w:r>
           </w:p>
         </w:tc>
@@ -3026,7 +3108,7 @@
               <w:rPr>
                 <w:sz w:val="22"/>
               </w:rPr>
-              <w:t xml:space="preserve">Mốc 06/10/2026 và mốc 07 ngày làm việc 15/10/2026</w:t>
+              <w:t xml:space="preserve">Nhận 17 giờ ngày 23/9 và ngày 06/10/2026; mốc 07 ngày làm việc 15/10/2026</w:t>
             </w:r>
           </w:p>
         </w:tc>
@@ -3156,7 +3238,7 @@
               <w:rPr>
                 <w:sz w:val="22"/>
               </w:rPr>
-              <w:t xml:space="preserve">Vận đơn và báo phát của Bưu điện Việt Nam (ES…) và Viettel Post (VTP…, TOM…), có ngày giờ giao và tên người nhận</w:t>
+              <w:t xml:space="preserve">Có ngày giờ giao, tên người nhận; tra được độc lập</w:t>
             </w:r>
           </w:p>
         </w:tc>
@@ -3172,21 +3254,13 @@
           <w:bCs/>
           <w:b/>
         </w:rPr>
-        <w:t xml:space="preserve">Tài liệu đề nghị Quý cơ quan thu thập khi kiểm tra</w:t>
-      </w:r>
-      <w:r>
-        <w:t xml:space="preserve"> </w:t>
-      </w:r>
-      <w:r>
-        <w:t xml:space="preserve">(tôi chưa được cấp bản sao): Công văn số 1436/TTr-TCDKNTC ngày 22/5/2026 của Thanh tra tỉnh và tài liệu chuyển kèm; Phiếu chuyển số 2707/SGDĐT-VP ngày 08/6/2026 của Sở Giáo dục và Đào tạo và tài liệu chuyển kèm.</w:t>
-      </w:r>
-    </w:p>
-    <w:p>
-      <w:pPr>
-        <w:pStyle w:val="BodyText"/>
-      </w:pPr>
-      <w:r>
-        <w:t xml:space="preserve">Toàn bộ chứng từ bưu chính kiểm chứng được độc lập với lời trình bày của tôi và của mọi cơ quan: mỗi mã tra được trên hệ thống của doanh nghiệp bưu chính, có ngày giờ giao và tên người nhận.</w:t>
+        <w:t xml:space="preserve">Tài liệu đề nghị Quý cơ quan thu thập</w:t>
+      </w:r>
+      <w:r>
+        <w:t xml:space="preserve"> </w:t>
+      </w:r>
+      <w:r>
+        <w:t xml:space="preserve">(tôi chưa được cấp bản sao): Công văn 1436 của Thanh tra tỉnh và Phiếu chuyển 2707 của Sở, cùng tài liệu chuyển kèm.</w:t>
       </w:r>
     </w:p>
     <w:p>
@@ -3210,18 +3284,10 @@
     <w:p>
       <w:pPr>
         <w:pStyle w:val="FirstParagraph"/>
+        <w:keepNext/>
       </w:pPr>
       <w:r>
         <w:t xml:space="preserve">Tôi cam đoan những nội dung trình bày trong đơn này và trong các tài liệu kèm theo là đúng sự thật. Mọi mốc ngày tháng đều dựa trên chứng từ tiếp nhận hoặc chứng từ bưu chính, và mọi đoạn trích văn bản của cơ quan đều chép nguyên văn từ bản gốc. Tôi xin chịu trách nhiệm trước pháp luật về nội dung đơn.</w:t>
-      </w:r>
-    </w:p>
-    <w:p>
-      <w:pPr>
-        <w:pStyle w:val="BodyText"/>
-        <w:keepNext/>
-      </w:pPr>
-      <w:r>
-        <w:t xml:space="preserve">Kính đề nghị Thanh tra Chính phủ trả lời bằng văn bản về địa chỉ đã ghi tại mục I.</w:t>
       </w:r>
     </w:p>
     <w:p>

</xml_diff>

<commit_message>
07.11: Việc 5 nêu đủ các điểm cần kiểm tra tại Sở GD&ĐT
Lấy từ Mục VII Đơn tố cáo ngày 14/9/2026 gửi Chủ tịch UBND tỉnh và Đơn
đề nghị ngày 29/9/2026 gửi Giám đốc Sở:
- đơn tố cáo nhận 16/5/2026 không có văn bản xử lý gửi người tố cáo;
- Phiếu chuyển 2707 ghi là đơn kiến nghị, phản ánh, ra vào ngày làm
  việc thứ 16, gửi phường mà không thông báo cho người gửi đơn;
- nội dung chuyên môn đi từ Sở về phường rồi trở lại Sở (Công văn 5609,
  Công văn 4809) mà chưa có kết luận, dù ảnh trình chiếu đã có tại Sở
  từ 16/5/2026;
- đơn ngày 29/9/2026 hỏi đúng các điểm ấy, chưa được trả lời.
Đề nghị 3 thêm sổ văn bản đến, đi và hồ sơ xử lý hai bưu gửi tại Sở.
Đơn nay 11 trang.

Co-Authored-By: Claude Opus 5.5 <noreply@anthropic.com>
Claude-Session: https://claude.ai/code/session_015JTqgRgcwweC4y1McBEsCj
</commit_message>
<xml_diff>
--- a/07.11 - Don kien nghi Thanh tra Chinh phu.docx
+++ b/07.11 - Don kien nghi Thanh tra Chinh phu.docx
@@ -1966,188 +1966,13 @@
           <w:bCs/>
           <w:b/>
         </w:rPr>
-        <w:t xml:space="preserve">Việc 5 — Hai đơn Sở Giáo dục và Đào tạo nhận từ tháng 5/2026, tôi chưa nhận được thông báo xử lý đối với từng đơn.</w:t>
-      </w:r>
-      <w:r>
-        <w:t xml:space="preserve"> </w:t>
-      </w:r>
-      <w:r>
-        <w:t xml:space="preserve">Ngày 16/5/2026 lúc 11 giờ 40, Sở nhận hai đơn của tôi, hai bưu gửi riêng, đều có báo phát, không bưu gửi nào bị trả lại: đơn tố cáo, ghi gửi Chánh Thanh tra Sở (ES805564955VN); và đơn đề nghị thẩm định chuyên môn khẩn cấp, tổ chức tiết đính chính kiến thức, gửi Giám đốc Sở (ES805564941VN). Với đơn tố cáo, dù cơ quan nhận tự xử lý hay chuyển đơn, mốc chậm nhất theo Điều 24 Luật Tố cáo là 29/5/2026 — đến ngày 28/10/2026 đã qua</w:t>
-      </w:r>
-      <w:r>
-        <w:t xml:space="preserve"> </w:t>
-      </w:r>
-      <w:r>
-        <w:rPr>
-          <w:bCs/>
-          <w:b/>
-        </w:rPr>
-        <w:t xml:space="preserve">152 ngày</w:t>
-      </w:r>
-      <w:r>
-        <w:t xml:space="preserve">; tôi chưa nhận được thông báo thụ lý, không thụ lý hay chuyển đơn đối với đơn nào, cũng chưa có kết quả thẩm định. Theo Công văn 6689 của Ủy ban nhân dân phường, Sở đã chuyển một đơn của tôi về phường bằng Phiếu chuyển số 2707/SGDĐT-VP ngày 08/6/2026,</w:t>
-      </w:r>
-      <w:r>
-        <w:t xml:space="preserve"> </w:t>
-      </w:r>
-      <w:r>
-        <w:rPr>
-          <w:iCs/>
-          <w:i/>
-        </w:rPr>
-        <w:t xml:space="preserve">“</w:t>
-      </w:r>
-      <w:r>
-        <w:rPr>
-          <w:iCs/>
-          <w:i/>
-        </w:rPr>
-        <w:t xml:space="preserve">để xem xét, xử lý theo thẩm quyền đối với các nội dung phản ánh, kiến nghị</w:t>
-      </w:r>
-      <w:r>
-        <w:rPr>
-          <w:iCs/>
-          <w:i/>
-        </w:rPr>
-        <w:t xml:space="preserve">”</w:t>
-      </w:r>
-      <w:r>
-        <w:t xml:space="preserve">. Phiếu ấy gửi phường, không gửi tôi; tôi không nhận được thông báo nào của Sở về việc chuyển đơn, chỉ biết đến phiếu khi đọc Công văn 6689 ngày 21/9/2026, và đến nay chưa được biết phiếu chuyển đơn nào, kèm tài liệu gì. Ngày 05/10/2026, Sở nhận thêm một đơn đề nghị của tôi gửi Giám đốc Sở (TOM153621923737), hỏi đúng điều này —</w:t>
-      </w:r>
-      <w:r>
-        <w:t xml:space="preserve"> </w:t>
-      </w:r>
-      <w:r>
-        <w:rPr>
-          <w:bCs/>
-          <w:b/>
-        </w:rPr>
-        <w:t xml:space="preserve">23 ngày</w:t>
-      </w:r>
-      <w:r>
-        <w:t xml:space="preserve">, tôi chưa nhận được văn bản.</w:t>
-      </w:r>
-    </w:p>
-    <w:p>
-      <w:pPr>
-        <w:pStyle w:val="BodyText"/>
-      </w:pPr>
-      <w:r>
-        <w:rPr>
-          <w:bCs/>
-          <w:b/>
-        </w:rPr>
-        <w:t xml:space="preserve">Việc 6 — Đơn kiến nghị gửi Bộ Giáo dục và Đào tạo, tôi chưa nhận được văn bản nào.</w:t>
-      </w:r>
-      <w:r>
-        <w:t xml:space="preserve"> </w:t>
-      </w:r>
-      <w:r>
-        <w:t xml:space="preserve">Ngày 21/8/2026, tôi gửi Bộ Giáo dục và Đào tạo đơn kiến nghị về nội dung chuyên môn của tiết dạy (bưu gửi ES805344322VN, có phiếu báo phát EX139130389VN). Đến ngày 28/10/2026 —</w:t>
-      </w:r>
-      <w:r>
-        <w:t xml:space="preserve"> </w:t>
-      </w:r>
-      <w:r>
-        <w:rPr>
-          <w:bCs/>
-          <w:b/>
-        </w:rPr>
-        <w:t xml:space="preserve">68 ngày</w:t>
-      </w:r>
-      <w:r>
-        <w:t xml:space="preserve"> </w:t>
-      </w:r>
-      <w:r>
-        <w:t xml:space="preserve">sau ngày gửi — tôi chưa nhận được văn bản nào, kể cả văn bản chuyển đơn.</w:t>
-      </w:r>
-    </w:p>
-    <w:p>
-      <w:pPr>
-        <w:pStyle w:val="BodyText"/>
-      </w:pPr>
-      <w:r>
-        <w:rPr>
-          <w:bCs/>
-          <w:b/>
-        </w:rPr>
-        <w:t xml:space="preserve">Việc 7 — Các câu hỏi chỉ Thanh tra tỉnh trả lời được đã đi qua hai lá đơn và hai văn bản mà chưa được trả lời.</w:t>
-      </w:r>
-      <w:r>
-        <w:t xml:space="preserve"> </w:t>
-      </w:r>
-      <w:r>
-        <w:t xml:space="preserve">Câu hỏi</w:t>
-      </w:r>
-      <w:r>
-        <w:t xml:space="preserve"> </w:t>
-      </w:r>
-      <w:r>
-        <w:rPr>
-          <w:iCs/>
-          <w:i/>
-        </w:rPr>
-        <w:t xml:space="preserve">“</w:t>
-      </w:r>
-      <w:r>
-        <w:rPr>
-          <w:iCs/>
-          <w:i/>
-        </w:rPr>
-        <w:t xml:space="preserve">trong hồ sơ của Thanh tra tỉnh có văn bản nào của tôi đề ngày 18/5/2026 hay không</w:t>
-      </w:r>
-      <w:r>
-        <w:rPr>
-          <w:iCs/>
-          <w:i/>
-        </w:rPr>
-        <w:t xml:space="preserve">”</w:t>
-      </w:r>
-      <w:r>
-        <w:t xml:space="preserve"> </w:t>
-      </w:r>
-      <w:r>
-        <w:t xml:space="preserve">— câu hỏi có hoặc không, trả lời được bằng một phép mở hồ sơ lưu — tôi hỏi trong đơn ngày 14/9/2026 (đơn bị trả lại cùng Phiếu 2960) và hỏi lại trong đơn ngày 06/10/2026 (Công văn 3292 không trả lời). Cùng số phận có các câu hỏi về văn bản được chuyển kèm Công văn 1436, về căn cứ phân loại, về trạng thái yêu cầu báo kết quả tại Phiếu chuyển 2329 và Văn bản 2644. Ngày 18/5/2026 là ngày bưu cục chấp nhận bưu gửi; lá đơn Thanh tra tỉnh nhận ngày 20/5/2026 đề ngày 16/5/2026; vậy mà cụm</w:t>
-      </w:r>
-      <w:r>
-        <w:t xml:space="preserve"> </w:t>
-      </w:r>
-      <w:r>
-        <w:rPr>
-          <w:iCs/>
-          <w:i/>
-        </w:rPr>
-        <w:t xml:space="preserve">“</w:t>
-      </w:r>
-      <w:r>
-        <w:rPr>
-          <w:iCs/>
-          <w:i/>
-        </w:rPr>
-        <w:t xml:space="preserve">đơn ghi ngày 18/5/2026</w:t>
-      </w:r>
-      <w:r>
-        <w:rPr>
-          <w:iCs/>
-          <w:i/>
-        </w:rPr>
-        <w:t xml:space="preserve">”</w:t>
-      </w:r>
-      <w:r>
-        <w:t xml:space="preserve"> </w:t>
-      </w:r>
-      <w:r>
-        <w:t xml:space="preserve">— cụm của Thông báo 5553 — được nhắc lại trong chính Công văn 3292. Bảng theo dõi từng câu hỏi ở Tài liệu số 1, mục N.2.</w:t>
-      </w:r>
-    </w:p>
-    <w:bookmarkEnd w:id="23"/>
-    <w:bookmarkStart w:id="24" w:name="iii.3.-đề-nghị"/>
-    <w:p>
-      <w:pPr>
-        <w:pStyle w:val="Heading3"/>
-      </w:pPr>
-      <w:r>
-        <w:t xml:space="preserve">III.3. Đề nghị</w:t>
+        <w:t xml:space="preserve">Việc 5 — Sở Giáo dục và Đào tạo: hai đơn nhận ngày 16/5/2026 và đơn nhận ngày 05/10/2026, tôi chưa nhận được văn bản nào của Sở trả lời các đơn ấy.</w:t>
+      </w:r>
+      <w:r>
+        <w:t xml:space="preserve"> </w:t>
+      </w:r>
+      <w:r>
+        <w:t xml:space="preserve">Ngày 16/5/2026 lúc 11 giờ 40, văn thư Sở nhận hai bưu gửi riêng của tôi, không bưu gửi nào bị trả lại: Đơn A — đơn tố cáo, ghi gửi Chánh Thanh tra Sở (ES805564955VN); Đơn C — đơn đề nghị thẩm định chuyên môn khẩn cấp, tổ chức tiết đính chính kiến thức, gửi Giám đốc Sở (ES805564941VN), kèm ảnh chụp các trang trình chiếu cần thẩm định. Những điểm cần kiểm tra:</w:t>
       </w:r>
     </w:p>
     <w:p>
@@ -2159,7 +1984,30 @@
         </w:numPr>
       </w:pPr>
       <w:r>
-        <w:t xml:space="preserve">Kiểm tra việc xử lý đơn tại Thanh tra tỉnh Lâm Đồng qua Phiếu hướng dẫn số 2960/HD-TTr và Công văn số 3292/TTr-PKNTC.1; yêu cầu Thanh tra tỉnh trả lời đủ các đề nghị tại mục 8 của Tài liệu số 1 — theo từng mục, có hoặc không, kèm tên tài liệu làm căn cứ — và báo cáo kết quả về Thanh tra Chính phủ.</w:t>
+        <w:rPr>
+          <w:bCs/>
+          <w:b/>
+        </w:rPr>
+        <w:t xml:space="preserve">Đơn tố cáo không có văn bản xử lý nào gửi tôi.</w:t>
+      </w:r>
+      <w:r>
+        <w:t xml:space="preserve"> </w:t>
+      </w:r>
+      <w:r>
+        <w:t xml:space="preserve">Dù cơ quan nhận tự xử lý hay chuyển đơn, mốc chậm nhất theo Điều 24 Luật Tố cáo là 29/5/2026 — đến ngày 28/10/2026 đã qua</w:t>
+      </w:r>
+      <w:r>
+        <w:t xml:space="preserve"> </w:t>
+      </w:r>
+      <w:r>
+        <w:rPr>
+          <w:bCs/>
+          <w:b/>
+        </w:rPr>
+        <w:t xml:space="preserve">152 ngày</w:t>
+      </w:r>
+      <w:r>
+        <w:t xml:space="preserve">; tôi chưa nhận được thông báo thụ lý, không thụ lý hay chuyển đơn. Bưu gửi ghi chức danh Chánh Thanh tra Sở, tại địa chỉ của Sở, trong khi tổ chức thanh tra thuộc Sở đã được sắp xếp lại năm 2025; tôi chưa được biết đơn vị nào của Sở đã nhận và xử lý đơn này.</w:t>
       </w:r>
     </w:p>
     <w:p>
@@ -2171,7 +2019,74 @@
         </w:numPr>
       </w:pPr>
       <w:r>
-        <w:t xml:space="preserve">Yêu cầu Chủ tịch Ủy ban nhân dân tỉnh Lâm Đồng báo cáo tình trạng xử lý Đơn tố cáo ngày 14/9/2026, cung cấp văn bản xử lý và chứng từ thông báo cho người tố cáo; làm rõ nguyên nhân chậm xử lý hoặc chậm thông báo, nếu có.</w:t>
+        <w:rPr>
+          <w:bCs/>
+          <w:b/>
+        </w:rPr>
+        <w:t xml:space="preserve">Phiếu chuyển 2707 gửi phường, không gửi tôi.</w:t>
+      </w:r>
+      <w:r>
+        <w:t xml:space="preserve"> </w:t>
+      </w:r>
+      <w:r>
+        <w:t xml:space="preserve">Theo Công văn 6689, ngày 08/6/2026 Sở chuyển</w:t>
+      </w:r>
+      <w:r>
+        <w:t xml:space="preserve"> </w:t>
+      </w:r>
+      <w:r>
+        <w:rPr>
+          <w:iCs/>
+          <w:i/>
+        </w:rPr>
+        <w:t xml:space="preserve">“</w:t>
+      </w:r>
+      <w:r>
+        <w:rPr>
+          <w:iCs/>
+          <w:i/>
+        </w:rPr>
+        <w:t xml:space="preserve">đơn của ông Trần Duy Tuệ</w:t>
+      </w:r>
+      <w:r>
+        <w:rPr>
+          <w:iCs/>
+          <w:i/>
+        </w:rPr>
+        <w:t xml:space="preserve">”</w:t>
+      </w:r>
+      <w:r>
+        <w:t xml:space="preserve"> </w:t>
+      </w:r>
+      <w:r>
+        <w:t xml:space="preserve">về Ủy ban nhân dân phường bằng Phiếu chuyển đơn kiến nghị, phản ánh số 2707/SGDĐT-VP,</w:t>
+      </w:r>
+      <w:r>
+        <w:t xml:space="preserve"> </w:t>
+      </w:r>
+      <w:r>
+        <w:rPr>
+          <w:iCs/>
+          <w:i/>
+        </w:rPr>
+        <w:t xml:space="preserve">“</w:t>
+      </w:r>
+      <w:r>
+        <w:rPr>
+          <w:iCs/>
+          <w:i/>
+        </w:rPr>
+        <w:t xml:space="preserve">để xem xét, xử lý theo thẩm quyền đối với các nội dung phản ánh, kiến nghị</w:t>
+      </w:r>
+      <w:r>
+        <w:rPr>
+          <w:iCs/>
+          <w:i/>
+        </w:rPr>
+        <w:t xml:space="preserve">”</w:t>
+      </w:r>
+      <w:r>
+        <w:t xml:space="preserve">. Không đơn nào trong hai đơn của tôi mang tên đơn kiến nghị, phản ánh. Phiếu ra vào ngày làm việc thứ 16 kể từ khi Sở nhận đơn; nếu phiếu chuyển Đơn A thì đã qua mốc 05 ngày làm việc tại khoản 2 Điều 24 Luật Tố cáo. Dù phiếu chuyển đơn nào, tôi cũng không nhận được thông báo chuyển đơn theo khoản 2 Điều 24 Luật Tố cáo, khoản 2 Điều 20 Thông tư 05 (tình huống 4); tôi chỉ biết đến phiếu khi đọc Công văn 6689 ngày 21/9/2026, và đến nay chưa được biết phiếu chuyển đơn nào, kèm tài liệu gì.</w:t>
       </w:r>
     </w:p>
     <w:p>
@@ -2183,7 +2098,47 @@
         </w:numPr>
       </w:pPr>
       <w:r>
-        <w:t xml:space="preserve">Theo dõi, đôn đốc đến kết quả việc giải quyết các đơn, hồ sơ sau, mà tôi chưa nhận được văn bản trả lời: tại Ủy ban nhân dân phường Phan Thiết — Hồ sơ tố cáo nhận ngày 09/7/2026, Đơn bổ sung tài liệu, chứng cứ nhận ngày 23/9/2026 và Đơn khiếu nại nhận ngày 06/10/2026 (Việc 1, 2, 3); tại Sở Giáo dục và Đào tạo — hai đơn nhận ngày 16/5/2026 và đơn nhận ngày 05/10/2026 (Việc 5); hai nơi này thông qua Chủ tịch Ủy ban nhân dân tỉnh Lâm Đồng; tại Bộ Giáo dục và Đào tạo — Đơn kiến nghị gửi ngày 21/8/2026 (Việc 6). Yêu cầu các nơi ấy báo cáo kết quả. Khi kiểm tra, thu thập hai văn bản tôi chưa được cấp: Công văn số 1436/TTr-TCDKNTC ngày 22/5/2026 và Phiếu chuyển số 2707/SGDĐT-VP ngày 08/6/2026, cùng tài liệu chuyển kèm. Đơn gửi Đoàn đại biểu Quốc hội tỉnh và kiến nghị gửi Ủy ban Kiểm tra Tỉnh ủy thuộc kênh giám sát khác, nên tôi không đề nghị ở đây.</w:t>
+        <w:rPr>
+          <w:bCs/>
+          <w:b/>
+        </w:rPr>
+        <w:t xml:space="preserve">Nội dung chuyên môn đi một vòng rồi trở về Sở, vẫn chưa có kết luận.</w:t>
+      </w:r>
+      <w:r>
+        <w:t xml:space="preserve"> </w:t>
+      </w:r>
+      <w:r>
+        <w:t xml:space="preserve">Sở chuyển nội dung ấy về phường (08/6/2026); phường lại đề nghị Sở cho ý kiến chuyên môn bằng Công văn 5609 ngày 03/9/2026, lập trên cơ sở báo cáo và tài liệu do nhà trường cung cấp; Sở trả lời phường bằng Công văn 4809 ngày 14/9/2026, nêu rằng để đánh giá các nội dung ấy</w:t>
+      </w:r>
+      <w:r>
+        <w:t xml:space="preserve"> </w:t>
+      </w:r>
+      <w:r>
+        <w:rPr>
+          <w:iCs/>
+          <w:i/>
+        </w:rPr>
+        <w:t xml:space="preserve">“</w:t>
+      </w:r>
+      <w:r>
+        <w:rPr>
+          <w:iCs/>
+          <w:i/>
+        </w:rPr>
+        <w:t xml:space="preserve">có chính xác, khoa học hay không thì phải thông qua cách triển khai cụ thể trong tiết học</w:t>
+      </w:r>
+      <w:r>
+        <w:rPr>
+          <w:iCs/>
+          <w:i/>
+        </w:rPr>
+        <w:t xml:space="preserve">”</w:t>
+      </w:r>
+      <w:r>
+        <w:t xml:space="preserve"> </w:t>
+      </w:r>
+      <w:r>
+        <w:t xml:space="preserve">— trong khi ảnh chụp các trang trình chiếu của chính tiết học ấy đã có tại Sở từ ngày 16/5/2026, kèm Đơn C. Đơn C ghi khẩn cấp, nêu mốc trước khi kết thúc năm học 2025-2026; mốc ấy đã qua, học sinh đã lên lớp 9, và tôi chưa nhận được kết quả thẩm định nào bằng văn bản.</w:t>
       </w:r>
     </w:p>
     <w:p>
@@ -2195,7 +2150,155 @@
         </w:numPr>
       </w:pPr>
       <w:r>
-        <w:t xml:space="preserve">Trả lời bằng văn bản, hướng dẫn việc áp dụng Thông tư số 05/2021/TT-TTCP trong năm tình huống tại mục III.1.</w:t>
+        <w:rPr>
+          <w:bCs/>
+          <w:b/>
+        </w:rPr>
+        <w:t xml:space="preserve">Đơn ngày 29/9/2026 hỏi đúng những điều trên, tôi chưa nhận được trả lời.</w:t>
+      </w:r>
+      <w:r>
+        <w:t xml:space="preserve"> </w:t>
+      </w:r>
+      <w:r>
+        <w:t xml:space="preserve">Ngày 05/10/2026, Sở nhận đơn đề nghị của tôi gửi Giám đốc Sở (TOM153621923737): hai đơn tháng 5 được vào sổ, phân loại thế nào; Phiếu 2707 chuyển đơn nào, kèm tài liệu gì; Sở đã xem những tài liệu nào khi ban hành Công văn 4809; thẩm định lại trên tài liệu gốc và chuẩn hoá kiến thức cho học sinh. Đó là kiến nghị về nội dung thuộc trách nhiệm quản lý của chính Sở (khoản 1 Điều 20 Thông tư 05); đến ngày 28/10/2026 —</w:t>
+      </w:r>
+      <w:r>
+        <w:t xml:space="preserve"> </w:t>
+      </w:r>
+      <w:r>
+        <w:rPr>
+          <w:bCs/>
+          <w:b/>
+        </w:rPr>
+        <w:t xml:space="preserve">23 ngày</w:t>
+      </w:r>
+      <w:r>
+        <w:t xml:space="preserve"> </w:t>
+      </w:r>
+      <w:r>
+        <w:t xml:space="preserve">— tôi chưa nhận được văn bản.</w:t>
+      </w:r>
+    </w:p>
+    <w:p>
+      <w:pPr>
+        <w:pStyle w:val="FirstParagraph"/>
+      </w:pPr>
+      <w:r>
+        <w:rPr>
+          <w:bCs/>
+          <w:b/>
+        </w:rPr>
+        <w:t xml:space="preserve">Việc 6 — Đơn kiến nghị gửi Bộ Giáo dục và Đào tạo, tôi chưa nhận được văn bản nào.</w:t>
+      </w:r>
+      <w:r>
+        <w:t xml:space="preserve"> </w:t>
+      </w:r>
+      <w:r>
+        <w:t xml:space="preserve">Ngày 21/8/2026, tôi gửi Bộ Giáo dục và Đào tạo đơn kiến nghị về nội dung chuyên môn của tiết dạy (bưu gửi ES805344322VN, có phiếu báo phát EX139130389VN). Đến ngày 28/10/2026 —</w:t>
+      </w:r>
+      <w:r>
+        <w:t xml:space="preserve"> </w:t>
+      </w:r>
+      <w:r>
+        <w:rPr>
+          <w:bCs/>
+          <w:b/>
+        </w:rPr>
+        <w:t xml:space="preserve">68 ngày</w:t>
+      </w:r>
+      <w:r>
+        <w:t xml:space="preserve"> </w:t>
+      </w:r>
+      <w:r>
+        <w:t xml:space="preserve">sau ngày gửi — tôi chưa nhận được văn bản nào, kể cả văn bản chuyển đơn.</w:t>
+      </w:r>
+    </w:p>
+    <w:p>
+      <w:pPr>
+        <w:pStyle w:val="BodyText"/>
+      </w:pPr>
+      <w:r>
+        <w:rPr>
+          <w:bCs/>
+          <w:b/>
+        </w:rPr>
+        <w:t xml:space="preserve">Việc 7 — Các câu hỏi chỉ Thanh tra tỉnh trả lời được đã đi qua hai lá đơn và hai văn bản mà chưa được trả lời.</w:t>
+      </w:r>
+      <w:r>
+        <w:t xml:space="preserve"> </w:t>
+      </w:r>
+      <w:r>
+        <w:t xml:space="preserve">Câu hỏi</w:t>
+      </w:r>
+      <w:r>
+        <w:t xml:space="preserve"> </w:t>
+      </w:r>
+      <w:r>
+        <w:rPr>
+          <w:iCs/>
+          <w:i/>
+        </w:rPr>
+        <w:t xml:space="preserve">“</w:t>
+      </w:r>
+      <w:r>
+        <w:rPr>
+          <w:iCs/>
+          <w:i/>
+        </w:rPr>
+        <w:t xml:space="preserve">trong hồ sơ của Thanh tra tỉnh có văn bản nào của tôi đề ngày 18/5/2026 hay không</w:t>
+      </w:r>
+      <w:r>
+        <w:rPr>
+          <w:iCs/>
+          <w:i/>
+        </w:rPr>
+        <w:t xml:space="preserve">”</w:t>
+      </w:r>
+      <w:r>
+        <w:t xml:space="preserve"> </w:t>
+      </w:r>
+      <w:r>
+        <w:t xml:space="preserve">— câu hỏi có hoặc không, trả lời được bằng một phép mở hồ sơ lưu — tôi hỏi trong đơn ngày 14/9/2026 (đơn bị trả lại cùng Phiếu 2960) và hỏi lại trong đơn ngày 06/10/2026 (Công văn 3292 không trả lời). Cùng số phận có các câu hỏi về văn bản được chuyển kèm Công văn 1436, về căn cứ phân loại, về trạng thái yêu cầu báo kết quả tại Phiếu chuyển 2329 và Văn bản 2644. Ngày 18/5/2026 là ngày bưu cục chấp nhận bưu gửi; lá đơn Thanh tra tỉnh nhận ngày 20/5/2026 đề ngày 16/5/2026; vậy mà cụm</w:t>
+      </w:r>
+      <w:r>
+        <w:t xml:space="preserve"> </w:t>
+      </w:r>
+      <w:r>
+        <w:rPr>
+          <w:iCs/>
+          <w:i/>
+        </w:rPr>
+        <w:t xml:space="preserve">“</w:t>
+      </w:r>
+      <w:r>
+        <w:rPr>
+          <w:iCs/>
+          <w:i/>
+        </w:rPr>
+        <w:t xml:space="preserve">đơn ghi ngày 18/5/2026</w:t>
+      </w:r>
+      <w:r>
+        <w:rPr>
+          <w:iCs/>
+          <w:i/>
+        </w:rPr>
+        <w:t xml:space="preserve">”</w:t>
+      </w:r>
+      <w:r>
+        <w:t xml:space="preserve"> </w:t>
+      </w:r>
+      <w:r>
+        <w:t xml:space="preserve">— cụm của Thông báo 5553 — được nhắc lại trong chính Công văn 3292. Bảng theo dõi từng câu hỏi ở Tài liệu số 1, mục N.2.</w:t>
+      </w:r>
+    </w:p>
+    <w:bookmarkEnd w:id="23"/>
+    <w:bookmarkStart w:id="24" w:name="iii.3.-đề-nghị"/>
+    <w:p>
+      <w:pPr>
+        <w:pStyle w:val="Heading3"/>
+      </w:pPr>
+      <w:r>
+        <w:t xml:space="preserve">III.3. Đề nghị</w:t>
       </w:r>
     </w:p>
     <w:p>
@@ -2203,11 +2306,11 @@
         <w:pStyle w:val="Compact"/>
         <w:numPr>
           <w:ilvl w:val="0"/>
-          <w:numId w:val="1003"/>
+          <w:numId w:val="1004"/>
         </w:numPr>
       </w:pPr>
       <w:r>
-        <w:t xml:space="preserve">Trường hợp có nội dung không thuộc thẩm quyền của Thanh tra Chính phủ: chuyển đơn và thông báo cho tôi theo khoản 2 Điều 20 Thông tư 05, ghi rõ nơi nhận, số và ngày văn bản chuyển, kèm yêu cầu nơi nhận báo cáo kết quả; hoặc hướng dẫn tôi bằng phiếu ghi rõ từng nội dung và nơi gửi — tôi sẽ làm đúng, như đã làm với Phiếu hướng dẫn 2960: trong 08 ngày, tôi đã tách và nộp lại hai đơn riêng. Kính đề nghị không chuyển đơn về chính các cơ quan mà đơn này kiến nghị kiểm tra mà không kèm yêu cầu báo cáo kết quả.</w:t>
+        <w:t xml:space="preserve">Kiểm tra việc xử lý đơn tại Thanh tra tỉnh Lâm Đồng qua Phiếu hướng dẫn số 2960/HD-TTr và Công văn số 3292/TTr-PKNTC.1; yêu cầu Thanh tra tỉnh trả lời đủ các đề nghị tại mục 8 của Tài liệu số 1 — theo từng mục, có hoặc không, kèm tên tài liệu làm căn cứ — và báo cáo kết quả về Thanh tra Chính phủ.</w:t>
       </w:r>
     </w:p>
     <w:p>
@@ -2215,7 +2318,55 @@
         <w:pStyle w:val="Compact"/>
         <w:numPr>
           <w:ilvl w:val="0"/>
-          <w:numId w:val="1003"/>
+          <w:numId w:val="1004"/>
+        </w:numPr>
+      </w:pPr>
+      <w:r>
+        <w:t xml:space="preserve">Yêu cầu Chủ tịch Ủy ban nhân dân tỉnh Lâm Đồng báo cáo tình trạng xử lý Đơn tố cáo ngày 14/9/2026, cung cấp văn bản xử lý và chứng từ thông báo cho người tố cáo; làm rõ nguyên nhân chậm xử lý hoặc chậm thông báo, nếu có.</w:t>
+      </w:r>
+    </w:p>
+    <w:p>
+      <w:pPr>
+        <w:pStyle w:val="Compact"/>
+        <w:numPr>
+          <w:ilvl w:val="0"/>
+          <w:numId w:val="1004"/>
+        </w:numPr>
+      </w:pPr>
+      <w:r>
+        <w:t xml:space="preserve">Theo dõi, đôn đốc đến kết quả việc giải quyết các đơn, hồ sơ sau, mà tôi chưa nhận được văn bản trả lời: tại Ủy ban nhân dân phường Phan Thiết — Hồ sơ tố cáo nhận ngày 09/7/2026, Đơn bổ sung tài liệu, chứng cứ nhận ngày 23/9/2026 và Đơn khiếu nại nhận ngày 06/10/2026 (Việc 1, 2, 3); tại Sở Giáo dục và Đào tạo — hai đơn nhận ngày 16/5/2026 và đơn nhận ngày 05/10/2026 (Việc 5); hai nơi này thông qua Chủ tịch Ủy ban nhân dân tỉnh Lâm Đồng; tại Bộ Giáo dục và Đào tạo — Đơn kiến nghị gửi ngày 21/8/2026 (Việc 6). Yêu cầu các nơi ấy báo cáo kết quả. Khi kiểm tra, thu thập hai văn bản tôi chưa được cấp: Công văn số 1436/TTr-TCDKNTC ngày 22/5/2026 và Phiếu chuyển số 2707/SGDĐT-VP ngày 08/6/2026, cùng tài liệu chuyển kèm; tại Sở, sổ văn bản đến, sổ văn bản đi từ ngày 16/5 đến ngày 08/6/2026 và hồ sơ xử lý hai bưu gửi ES805564955VN, ES805564941VN. Đơn gửi Đoàn đại biểu Quốc hội tỉnh và kiến nghị gửi Ủy ban Kiểm tra Tỉnh ủy thuộc kênh giám sát khác, nên tôi không đề nghị ở đây.</w:t>
+      </w:r>
+    </w:p>
+    <w:p>
+      <w:pPr>
+        <w:pStyle w:val="Compact"/>
+        <w:numPr>
+          <w:ilvl w:val="0"/>
+          <w:numId w:val="1004"/>
+        </w:numPr>
+      </w:pPr>
+      <w:r>
+        <w:t xml:space="preserve">Trả lời bằng văn bản, hướng dẫn việc áp dụng Thông tư số 05/2021/TT-TTCP trong năm tình huống tại mục III.1.</w:t>
+      </w:r>
+    </w:p>
+    <w:p>
+      <w:pPr>
+        <w:pStyle w:val="Compact"/>
+        <w:numPr>
+          <w:ilvl w:val="0"/>
+          <w:numId w:val="1004"/>
+        </w:numPr>
+      </w:pPr>
+      <w:r>
+        <w:t xml:space="preserve">Trường hợp có nội dung không thuộc thẩm quyền của Thanh tra Chính phủ: chuyển đơn và thông báo cho tôi theo khoản 2 Điều 20 Thông tư 05, ghi rõ nơi nhận, số và ngày văn bản chuyển, kèm yêu cầu nơi nhận báo cáo kết quả; hoặc hướng dẫn tôi bằng phiếu ghi rõ từng nội dung và nơi gửi — tôi sẽ làm đúng, như đã làm với Phiếu hướng dẫn 2960: trong 08 ngày, tôi đã tách và nộp lại hai đơn riêng. Kính đề nghị không chuyển đơn về chính các cơ quan mà đơn này kiến nghị kiểm tra mà không kèm yêu cầu báo cáo kết quả.</w:t>
+      </w:r>
+    </w:p>
+    <w:p>
+      <w:pPr>
+        <w:pStyle w:val="Compact"/>
+        <w:numPr>
+          <w:ilvl w:val="0"/>
+          <w:numId w:val="1004"/>
         </w:numPr>
       </w:pPr>
       <w:r>
@@ -3778,6 +3929,9 @@
     <w:abstractNumId w:val="991"/>
   </w:num>
   <w:num w:numId="1003">
+    <w:abstractNumId w:val="991"/>
+  </w:num>
+  <w:num w:numId="1004">
     <w:abstractNumId w:val="99411"/>
     <w:lvlOverride w:ilvl="0">
       <w:startOverride w:val="1"/>

</xml_diff>